<commit_message>
Preenche formulario oficial em DOCX de alteracao do PPC para o CEPE
</commit_message>
<xml_diff>
--- a/tecnico-administracao/form-alteracao-ppc-adm/formulario-alteracao-ppc-adm-PPC_23-07-18.docx
+++ b/tecnico-administracao/form-alteracao-ppc-adm/formulario-alteracao-ppc-adm-PPC_23-07-18.docx
@@ -114,6 +114,14 @@
         </w:rPr>
         <w:t xml:space="preserve">1 Campus: </w:t>
       </w:r>
+      <w:r>
+        <w:rPr>
+          <w:rFonts w:ascii="Arial" w:hAnsi="Arial"/>
+          <w:b w:val="0"/>
+          <w:sz w:val="22"/>
+        </w:rPr>
+        <w:t>Garopaba</w:t>
+      </w:r>
     </w:p>
     <w:p>
       <w:pPr>
@@ -140,6 +148,14 @@
         </w:rPr>
         <w:t xml:space="preserve">2 Departamento: </w:t>
       </w:r>
+      <w:r>
+        <w:rPr>
+          <w:rFonts w:ascii="Arial" w:hAnsi="Arial"/>
+          <w:b w:val="0"/>
+          <w:sz w:val="22"/>
+        </w:rPr>
+        <w:t>Departamento de Ensino, Pesquisa e Extensão (DEPE)</w:t>
+      </w:r>
     </w:p>
     <w:p>
       <w:pPr>
@@ -160,6 +176,14 @@
           <w:rtl w:val="0"/>
         </w:rPr>
         <w:t xml:space="preserve">3 Contatos/Telefone do campus: </w:t>
+      </w:r>
+      <w:r>
+        <w:rPr>
+          <w:rFonts w:ascii="Arial" w:hAnsi="Arial"/>
+          <w:b w:val="0"/>
+          <w:sz w:val="22"/>
+        </w:rPr>
+        <w:t>(48) 3254-7336 | depe.gpa@ifsc.edu.br | direcao.gpa@ifsc.edu.br</w:t>
       </w:r>
     </w:p>
     <w:p>
@@ -279,6 +303,14 @@
         </w:rPr>
         <w:t xml:space="preserve">4 Nome do curso: </w:t>
       </w:r>
+      <w:r>
+        <w:rPr>
+          <w:rFonts w:ascii="Arial" w:hAnsi="Arial"/>
+          <w:b w:val="0"/>
+          <w:sz w:val="22"/>
+        </w:rPr>
+        <w:t>Curso Técnico em Administração Integrado ao Ensino Médio</w:t>
+      </w:r>
     </w:p>
     <w:p>
       <w:pPr>
@@ -356,6 +388,14 @@
         </w:rPr>
         <w:t xml:space="preserve"> </w:t>
       </w:r>
+      <w:r>
+        <w:rPr>
+          <w:rFonts w:ascii="Arial" w:hAnsi="Arial"/>
+          <w:b w:val="0"/>
+          <w:sz w:val="22"/>
+        </w:rPr>
+        <w:t>Resolução CEPE nº 042/2016 (Criação/Autorização) | Resolução CONSUP/IFSC nº 142/2025 (Diretrizes de Reformulação)</w:t>
+      </w:r>
     </w:p>
     <w:p>
       <w:pPr>
@@ -381,6 +421,14 @@
           <w:rtl w:val="0"/>
         </w:rPr>
         <w:t xml:space="preserve">6 Forma de oferta: </w:t>
+      </w:r>
+      <w:r>
+        <w:rPr>
+          <w:rFonts w:ascii="Arial" w:hAnsi="Arial"/>
+          <w:b w:val="0"/>
+          <w:sz w:val="22"/>
+        </w:rPr>
+        <w:t>Presencial Integrada ao Ensino Médio (Turno Matutino, 40 vagas de ingresso anual, 6 semestres / 3 anos)</w:t>
       </w:r>
     </w:p>
     <w:p>
@@ -554,41 +602,179 @@
           </w:tcPr>
           <w:p>
             <w:pPr>
-              <w:keepNext w:val="0"/>
-              <w:keepLines w:val="0"/>
-              <w:pageBreakBefore w:val="0"/>
-              <w:widowControl w:val="0"/>
-              <w:pBdr>
-                <w:top w:space="0" w:sz="0" w:val="nil"/>
-                <w:left w:space="0" w:sz="0" w:val="nil"/>
-                <w:bottom w:space="0" w:sz="0" w:val="nil"/>
-                <w:right w:space="0" w:sz="0" w:val="nil"/>
-                <w:between w:space="0" w:sz="0" w:val="nil"/>
-              </w:pBdr>
-              <w:shd w:fill="auto" w:val="clear"/>
-              <w:spacing w:after="0" w:before="0" w:line="240" w:lineRule="auto"/>
-              <w:ind w:left="0" w:right="0" w:firstLine="0"/>
+              <w:spacing w:before="60" w:after="80" w:line="276" w:lineRule="auto"/>
               <w:jc w:val="both"/>
-              <w:rPr>
-                <w:rFonts w:ascii="Arial" w:cs="Arial" w:eastAsia="Arial" w:hAnsi="Arial"/>
+            </w:pPr>
+            <w:r/>
+            <w:r>
+              <w:rPr>
+                <w:rFonts w:ascii="Arial" w:hAnsi="Arial"/>
+                <w:b/>
+                <w:sz w:val="20"/>
+              </w:rPr>
+              <w:t xml:space="preserve">1. Seção IV – Carga Horária Total e Integralização Curricular: </w:t>
+            </w:r>
+            <w:r>
+              <w:rPr>
+                <w:rFonts w:ascii="Arial" w:hAnsi="Arial"/>
                 <w:b w:val="0"/>
-                <w:bCs w:val="0"/>
-                <w:i w:val="0"/>
-                <w:iCs w:val="0"/>
-                <w:smallCaps w:val="0"/>
-                <w:strike w:val="0"/>
-                <w:color w:val="000000"/>
-                <w:sz w:val="24"/>
-                <w:szCs w:val="24"/>
-                <w:u w:val="none"/>
-                <w:shd w:fill="auto" w:val="clear"/>
-                <w:vertAlign w:val="baseline"/>
-              </w:rPr>
+                <w:sz w:val="20"/>
+              </w:rPr>
+              <w:t>Ajuste e harmonização da carga horária global em 3.120 horas (3.040 horas presenciais e 80 horas a distância amparadas pedagogicamente), assegurando plenamente o piso da Formação Geral Básica do IFSC (2.120h) e o mínimo do Catálogo Nacional de Cursos Técnicos (CNCT/MEC - 1.000h para o eixo de Gestão e Negócios).</w:t>
+            </w:r>
+          </w:p>
+          <w:p>
+            <w:pPr>
+              <w:spacing w:before="60" w:after="80" w:line="276" w:lineRule="auto"/>
+              <w:jc w:val="both"/>
             </w:pPr>
             <w:r>
               <w:rPr>
-                <w:rtl w:val="0"/>
-              </w:rPr>
+                <w:rFonts w:ascii="Arial" w:hAnsi="Arial"/>
+                <w:b/>
+                <w:sz w:val="20"/>
+              </w:rPr>
+              <w:t xml:space="preserve">2. Seção IV – Marco Legal, Normativas Institucionais e Cidadania Digital: </w:t>
+            </w:r>
+            <w:r>
+              <w:rPr>
+                <w:rFonts w:ascii="Arial" w:hAnsi="Arial"/>
+                <w:b w:val="0"/>
+                <w:sz w:val="20"/>
+              </w:rPr>
+              <w:t>Alinhamento integral à Resolução CONSUP/IFSC nº 142/2025, ao Regulamento Didático-Pedagógico (RDP 2021) e às DCNs de EPT; Inclusão formal do Subitem 10.6 dedicado à Proteção de Dados, Segurança da Informação e Cidadania Digital (Lei nº 13.709/2018 - LGPD e Marco Civil da Internet).</w:t>
+            </w:r>
+          </w:p>
+          <w:p>
+            <w:pPr>
+              <w:spacing w:before="60" w:after="80" w:line="276" w:lineRule="auto"/>
+              <w:jc w:val="both"/>
+            </w:pPr>
+            <w:r>
+              <w:rPr>
+                <w:rFonts w:ascii="Arial" w:hAnsi="Arial"/>
+                <w:b/>
+                <w:sz w:val="20"/>
+              </w:rPr>
+              <w:t xml:space="preserve">3. Seção IV – Perfil Profissional de Conclusão / Perfil do Egresso: </w:t>
+            </w:r>
+            <w:r>
+              <w:rPr>
+                <w:rFonts w:ascii="Arial" w:hAnsi="Arial"/>
+                <w:b w:val="0"/>
+                <w:sz w:val="20"/>
+              </w:rPr>
+              <w:t>Reestruturação das competências profissionais e gerais, priorizando a formação cidadã crítica, o raciocínio analítico para tomada de decisões, trabalho colaborativo, fluência em ferramentas de gestão e compromisso com o desenvolvimento socioeconômico sustentável regional.</w:t>
+            </w:r>
+          </w:p>
+          <w:p>
+            <w:pPr>
+              <w:spacing w:before="60" w:after="80" w:line="276" w:lineRule="auto"/>
+              <w:jc w:val="both"/>
+            </w:pPr>
+            <w:r>
+              <w:rPr>
+                <w:rFonts w:ascii="Arial" w:hAnsi="Arial"/>
+                <w:b/>
+                <w:sz w:val="20"/>
+              </w:rPr>
+              <w:t xml:space="preserve">4. Seção V – Matriz Curricular e Organização dos Três Anos Letivos: </w:t>
+            </w:r>
+            <w:r>
+              <w:rPr>
+                <w:rFonts w:ascii="Arial" w:hAnsi="Arial"/>
+                <w:b w:val="0"/>
+                <w:sz w:val="20"/>
+              </w:rPr>
+              <w:t>Sanitização pedagógica do Ensino Médio Integrado: superação de fragmentações da reforma do ensino médio e remoção da terminologia segregada "BNCC"; implantação das unidades de Oficina de Integração I (80h - 2º ano) e Oficina de Integração II (80h - 3º ano); garantia da formação plurilíngue integrada (120h de Língua Espanhola e 120h de Língua Inglesa).</w:t>
+            </w:r>
+          </w:p>
+          <w:p>
+            <w:pPr>
+              <w:spacing w:before="60" w:after="80" w:line="276" w:lineRule="auto"/>
+              <w:jc w:val="both"/>
+            </w:pPr>
+            <w:r>
+              <w:rPr>
+                <w:rFonts w:ascii="Arial" w:hAnsi="Arial"/>
+                <w:b/>
+                <w:sz w:val="20"/>
+              </w:rPr>
+              <w:t xml:space="preserve">5. Seção V – Ementário, Metodologias Ativas e Bibliografias das 45 Unidades Curriculares: </w:t>
+            </w:r>
+            <w:r>
+              <w:rPr>
+                <w:rFonts w:ascii="Arial" w:hAnsi="Arial"/>
+                <w:b w:val="0"/>
+                <w:sz w:val="20"/>
+              </w:rPr>
+              <w:t>Padronização dos conteúdos programáticos em tópicos objetivos; explicitação de estratégias de metodologias ativas (Aprendizagem Baseada em Problemas - PBL, Estudos de Caso e Simulações Gerenciais); saneamento integral de 284 referências bibliográficas pela ABNT NBR 6023:2025, priorizando títulos disponíveis no acervo do Câmpus e nas plataformas digitais institucionais (Minha Biblioteca e Pearson).</w:t>
+            </w:r>
+          </w:p>
+          <w:p>
+            <w:pPr>
+              <w:spacing w:before="60" w:after="80" w:line="276" w:lineRule="auto"/>
+              <w:jc w:val="both"/>
+            </w:pPr>
+            <w:r>
+              <w:rPr>
+                <w:rFonts w:ascii="Arial" w:hAnsi="Arial"/>
+                <w:b/>
+                <w:sz w:val="20"/>
+              </w:rPr>
+              <w:t xml:space="preserve">6. Seção VII – Infraestrutura Didática e Ambientes Práticos de Formação: </w:t>
+            </w:r>
+            <w:r>
+              <w:rPr>
+                <w:rFonts w:ascii="Arial" w:hAnsi="Arial"/>
+                <w:b w:val="0"/>
+                <w:sz w:val="20"/>
+              </w:rPr>
+              <w:t>Inclusão formal no catálogo de ambientes do Laboratório de Inovação, Empreendedorismo e Desenvolvimento Sustentável (LINEDS) (Sala B101) como espaço maker/incubador para práticas de gestão e simulação de negócios reais.</w:t>
+            </w:r>
+          </w:p>
+          <w:p>
+            <w:pPr>
+              <w:spacing w:before="60" w:after="80" w:line="276" w:lineRule="auto"/>
+              <w:jc w:val="both"/>
+            </w:pPr>
+            <w:r>
+              <w:rPr>
+                <w:rFonts w:ascii="Arial" w:hAnsi="Arial"/>
+                <w:b/>
+                <w:sz w:val="20"/>
+              </w:rPr>
+              <w:t xml:space="preserve">7. Seção VIII – Corpo Docente e Técnico-Administrativo: </w:t>
+            </w:r>
+            <w:r>
+              <w:rPr>
+                <w:rFonts w:ascii="Arial" w:hAnsi="Arial"/>
+                <w:b w:val="0"/>
+                <w:sz w:val="20"/>
+              </w:rPr>
+              <w:t>Atualização quantitativa e qualitativa do corpo docente para 37 professores efetivos em Regime de Dedicação Exclusiva (RDE, com ampla maioria de mestres e doutores) e 17 servidores técnico-administrativos.</w:t>
+            </w:r>
+          </w:p>
+          <w:p>
+            <w:pPr>
+              <w:spacing w:before="60" w:after="80" w:line="276" w:lineRule="auto"/>
+              <w:jc w:val="both"/>
+            </w:pPr>
+            <w:r>
+              <w:rPr>
+                <w:rFonts w:ascii="Arial" w:hAnsi="Arial"/>
+                <w:b/>
+                <w:sz w:val="20"/>
+              </w:rPr>
+              <w:t xml:space="preserve">8. Seção IX – Mecanismos de Permanência, Inclusão e Avaliação da Aprendizagem: </w:t>
+            </w:r>
+            <w:r>
+              <w:rPr>
+                <w:rFonts w:ascii="Arial" w:hAnsi="Arial"/>
+                <w:b w:val="0"/>
+                <w:sz w:val="20"/>
+              </w:rPr>
+              <w:t>Fortalecimento da articulação pedagógica com o NAPNE, NEABI e Assistência Estudantil (PAE); consolidação da avaliação contínua, formativa e diagnóstica com recuperação paralela mandatória nos termos do RDP.</w:t>
             </w:r>
           </w:p>
         </w:tc>
@@ -768,41 +954,141 @@
           </w:tcPr>
           <w:p>
             <w:pPr>
-              <w:keepNext w:val="0"/>
-              <w:keepLines w:val="0"/>
-              <w:pageBreakBefore w:val="0"/>
-              <w:widowControl w:val="0"/>
-              <w:pBdr>
-                <w:top w:space="0" w:sz="0" w:val="nil"/>
-                <w:left w:space="0" w:sz="0" w:val="nil"/>
-                <w:bottom w:space="0" w:sz="0" w:val="nil"/>
-                <w:right w:space="0" w:sz="0" w:val="nil"/>
-                <w:between w:space="0" w:sz="0" w:val="nil"/>
-              </w:pBdr>
-              <w:shd w:fill="auto" w:val="clear"/>
-              <w:spacing w:after="0" w:before="0" w:line="240" w:lineRule="auto"/>
-              <w:ind w:left="0" w:right="0" w:firstLine="0"/>
+              <w:spacing w:before="80" w:after="80" w:line="276" w:lineRule="auto"/>
               <w:jc w:val="both"/>
-              <w:rPr>
-                <w:rFonts w:ascii="Arial" w:cs="Arial" w:eastAsia="Arial" w:hAnsi="Arial"/>
+            </w:pPr>
+            <w:r/>
+            <w:r>
+              <w:rPr>
+                <w:rFonts w:ascii="Arial" w:hAnsi="Arial"/>
+                <w:b/>
+                <w:sz w:val="21"/>
+              </w:rPr>
+              <w:t>Contextualização e Finalidade da Reformulação</w:t>
+              <w:br/>
+            </w:r>
+            <w:r>
+              <w:rPr>
+                <w:rFonts w:ascii="Arial" w:hAnsi="Arial"/>
                 <w:b w:val="0"/>
-                <w:bCs w:val="0"/>
-                <w:i w:val="0"/>
-                <w:iCs w:val="0"/>
-                <w:smallCaps w:val="0"/>
-                <w:strike w:val="0"/>
-                <w:color w:val="000000"/>
-                <w:sz w:val="24"/>
-                <w:szCs w:val="24"/>
-                <w:u w:val="none"/>
-                <w:shd w:fill="auto" w:val="clear"/>
-                <w:vertAlign w:val="baseline"/>
-              </w:rPr>
+                <w:sz w:val="20"/>
+              </w:rPr>
+              <w:t>A presente proposta de alteração do Projeto Pedagógico do Curso Técnico em Administração Integrado ao Ensino Médio do IFSC Câmpus Garopaba decorre dos trabalhos da Comissão de Revisão e Reformulação instituída pela Portaria DG nº 186/2026 (que alterou a Portaria DG nº 156/2026). A reformulação tem como finalidade central atualizar a proposta pedagógica e curricular do curso às novas diretrizes institucionais emanadas pelo Conselho Superior do IFSC e às profundas transformações socioeconômicas e produtivas do mundo do trabalho contemporâneo.</w:t>
+            </w:r>
+          </w:p>
+          <w:p>
+            <w:pPr>
+              <w:spacing w:before="80" w:after="80" w:line="276" w:lineRule="auto"/>
+              <w:jc w:val="both"/>
             </w:pPr>
             <w:r>
               <w:rPr>
-                <w:rtl w:val="0"/>
-              </w:rPr>
+                <w:rFonts w:ascii="Arial" w:hAnsi="Arial"/>
+                <w:b/>
+                <w:sz w:val="21"/>
+              </w:rPr>
+              <w:t>1. Alinhamento Institucional e Razoabilidade da Carga Horária</w:t>
+              <w:br/>
+            </w:r>
+            <w:r>
+              <w:rPr>
+                <w:rFonts w:ascii="Arial" w:hAnsi="Arial"/>
+                <w:b w:val="0"/>
+                <w:sz w:val="20"/>
+              </w:rPr>
+              <w:t>A reformulação cumpre com rigor técnico a Resolução CONSUP/IFSC nº 142, de 16 de dezembro de 2025, que fixou as novas diretrizes institucionais para a oferta dos Cursos Técnicos Integrados ao Ensino Médio na Rede IFSC. A matriz curricular foi harmonizada em uma Carga Horária Total de 3.120 horas (com 3.040 horas presenciais e 80 horas de atividades a distância amparadas pedagogicamente), distribuídas equilibradamente ao longo de três anos letivos: 1.040 horas no 1º ano, 1.200 horas no 2º ano e 880 horas no 3º ano. Esta organização elimina a sobrecarga pedagógica excessiva diária para os discentes adolescentes, assegurando o cumprimento estrito tanto do piso de 2.120 horas da Formação Geral Básica quanto das 1.000 horas de Formação Profissional Técnica exigidas pelo Catálogo Nacional de Cursos Técnicos (CNCT/MEC para o eixo de Gestão e Negócios). Ademais, o documento incorpora o alinhamento pleno às normas do Regulamento Didático-Pedagógico (RDP - Resolução CONSUP nº 23/2021).</w:t>
+            </w:r>
+          </w:p>
+          <w:p>
+            <w:pPr>
+              <w:spacing w:before="80" w:after="80" w:line="276" w:lineRule="auto"/>
+              <w:jc w:val="both"/>
+            </w:pPr>
+            <w:r>
+              <w:rPr>
+                <w:rFonts w:ascii="Arial" w:hAnsi="Arial"/>
+                <w:b/>
+                <w:sz w:val="21"/>
+              </w:rPr>
+              <w:t>2. Concepção Pedagógica: Formação Humana Integral e Politecnia</w:t>
+              <w:br/>
+            </w:r>
+            <w:r>
+              <w:rPr>
+                <w:rFonts w:ascii="Arial" w:hAnsi="Arial"/>
+                <w:b w:val="0"/>
+                <w:sz w:val="20"/>
+              </w:rPr>
+              <w:t>O projeto reafirma categoricamente a concepção de Formação Humana Integral e a Politecnia, fundamentada nos pilares da Pedagogia Histórico-Crítica (Dermeval Saviani). Rejeita-se qualquer fragmentação tecnicista ou empobrecimento da base científica e humanística, articulando trabalho, ciência, cultura e tecnologia como princípios indissociáveis. A integração curricular efetiva-se através da metodologia de Ciclos Temáticos e pela introdução das unidades curriculares basilares de Oficina de Integração I (80h no 2º ano) e Oficina de Integração II (80h no 3º ano). Nessas oficinas interdisciplinares, os estudantes desenvolvem projetos de intervenção socioprodutiva baseados em problemas reais do ecossistema regional de Garopaba e do Litoral Sul catarinense, consolidando a práxis entre teoria e prática.</w:t>
+            </w:r>
+          </w:p>
+          <w:p>
+            <w:pPr>
+              <w:spacing w:before="80" w:after="80" w:line="276" w:lineRule="auto"/>
+              <w:jc w:val="both"/>
+            </w:pPr>
+            <w:r>
+              <w:rPr>
+                <w:rFonts w:ascii="Arial" w:hAnsi="Arial"/>
+                <w:b/>
+                <w:sz w:val="21"/>
+              </w:rPr>
+              <w:t>3. Modernização Temática, Cidadania Digital e Infraestrutura Prática</w:t>
+              <w:br/>
+            </w:r>
+            <w:r>
+              <w:rPr>
+                <w:rFonts w:ascii="Arial" w:hAnsi="Arial"/>
+                <w:b w:val="0"/>
+                <w:sz w:val="20"/>
+              </w:rPr>
+              <w:t>O perfil do egresso e a matriz técnica foram modernizados com temáticas de vanguarda da área de Gestão e Negócios: (a) Inclusão do Subitem 10.6 dedicado à Proteção de Dados, Segurança da Informação e Cidadania Digital (Lei nº 13.709/2018 - LGPD e Marco Civil da Internet), garantindo a formação ética no tratamento e governança de dados organizacionais; (b) Incorporação de sustentabilidade socioambiental, critérios ESG (Environmental, Social and Governance) e economia circular nos componentes de processos, operações e empreendedorismo; (c) Redimensionamento da unidade de Gestão de Pessoas (80h) voltada à liderança humanizada, inteligência socioemocional e trabalho colaborativo; (d) Formalização no PPC do Laboratório de Inovação, Empreendedorismo e Desenvolvimento Sustentável (LINEDS - Sala B101) como infraestrutura prática institucional para ideação, incubação social e simulações empresariais.</w:t>
+            </w:r>
+          </w:p>
+          <w:p>
+            <w:pPr>
+              <w:spacing w:before="80" w:after="80" w:line="276" w:lineRule="auto"/>
+              <w:jc w:val="both"/>
+            </w:pPr>
+            <w:r>
+              <w:rPr>
+                <w:rFonts w:ascii="Arial" w:hAnsi="Arial"/>
+                <w:b/>
+                <w:sz w:val="21"/>
+              </w:rPr>
+              <w:t>4. Transparência Didática, Acesso Democrático à Bibliografia e Avaliação Emancipatória</w:t>
+              <w:br/>
+            </w:r>
+            <w:r>
+              <w:rPr>
+                <w:rFonts w:ascii="Arial" w:hAnsi="Arial"/>
+                <w:b w:val="0"/>
+                <w:sz w:val="20"/>
+              </w:rPr>
+              <w:t>O ementário de todas as 45 unidades curriculares foi padronizado em tópicos claros e objetivos, acompanhado da explicitação de estratégias de metodologias ativas (Aprendizagem Baseada em Problemas - PBL, Estudos de Casos Reais e Simulações Gerenciais). As bibliografias básica e complementar (total de 284 títulos) foram 100% saneadas e normalizadas segundo a norma ABNT NBR 6023:2025, priorizando obras existentes no acervo físico do Câmpus Garopaba e títulos amplamente acessíveis nas plataformas digitais institucionais (Minha Biblioteca e Biblioteca Virtual Pearson), eliminando barreiras financeiras e materiais para o êxito discente. A avaliação da aprendizagem é consolidada como processo formativo, contínuo e emancipatório, com recuperação paralela obrigatória e concomitante ao período letivo, resguardada pelo acompanhamento do Colegiado de Curso e do setor pedagógico.</w:t>
+            </w:r>
+          </w:p>
+          <w:p>
+            <w:pPr>
+              <w:spacing w:before="80" w:after="80" w:line="276" w:lineRule="auto"/>
+              <w:jc w:val="both"/>
+            </w:pPr>
+            <w:r>
+              <w:rPr>
+                <w:rFonts w:ascii="Arial" w:hAnsi="Arial"/>
+                <w:b/>
+                <w:sz w:val="21"/>
+              </w:rPr>
+              <w:t>Conclusão e Encaminhamento</w:t>
+              <w:br/>
+            </w:r>
+            <w:r>
+              <w:rPr>
+                <w:rFonts w:ascii="Arial" w:hAnsi="Arial"/>
+                <w:b w:val="0"/>
+                <w:sz w:val="20"/>
+              </w:rPr>
+              <w:t>Com base na sólida consistência legal, pedagógica, documental e de infraestrutura apresentada, encaminha-se a presente proposta de alteração de Projeto Pedagógico de Curso à homologação pelo Colegiado do Câmpus Garopaba e, na sequência, à apreciação e deliberação da Câmara de Ensino, Pesquisa e Extensão (CEPE/IFSC).</w:t>
             </w:r>
           </w:p>
         </w:tc>
@@ -1058,7 +1344,7 @@
         <w:shd w:fill="auto" w:val="clear"/>
         <w:spacing w:after="0" w:before="0" w:line="240" w:lineRule="auto"/>
         <w:ind w:left="0" w:right="0" w:firstLine="0"/>
-        <w:jc w:val="both"/>
+        <w:jc w:val="right"/>
         <w:rPr>
           <w:rFonts w:ascii="Arial" w:cs="Arial" w:eastAsia="Arial" w:hAnsi="Arial"/>
           <w:b w:val="0"/>
@@ -1077,6 +1363,31 @@
       </w:pPr>
       <w:r>
         <w:rPr>
+          <w:rFonts w:ascii="Arial" w:hAnsi="Arial"/>
+          <w:b w:val="0"/>
+          <w:sz w:val="22"/>
+        </w:rPr>
+        <w:t>Garopaba (SC), 09 de setembro de 2026.</w:t>
+      </w:r>
+    </w:p>
+    <w:p>
+      <w:pPr>
+        <w:keepNext w:val="0"/>
+        <w:keepLines w:val="0"/>
+        <w:pageBreakBefore w:val="0"/>
+        <w:widowControl w:val="0"/>
+        <w:pBdr>
+          <w:top w:space="0" w:sz="0" w:val="nil"/>
+          <w:left w:space="0" w:sz="0" w:val="nil"/>
+          <w:bottom w:space="0" w:sz="0" w:val="nil"/>
+          <w:right w:space="0" w:sz="0" w:val="nil"/>
+          <w:between w:space="0" w:sz="0" w:val="nil"/>
+        </w:pBdr>
+        <w:shd w:fill="auto" w:val="clear"/>
+        <w:spacing w:after="0" w:before="0" w:line="240" w:lineRule="auto"/>
+        <w:ind w:left="0" w:right="0" w:firstLine="0"/>
+        <w:jc w:val="right"/>
+        <w:rPr>
           <w:rFonts w:ascii="Arial" w:cs="Arial" w:eastAsia="Arial" w:hAnsi="Arial"/>
           <w:b w:val="0"/>
           <w:bCs w:val="0"/>
@@ -1090,9 +1401,12 @@
           <w:u w:val="none"/>
           <w:shd w:fill="auto" w:val="clear"/>
           <w:vertAlign w:val="baseline"/>
-          <w:rtl w:val="0"/>
-        </w:rPr>
-        <w:t xml:space="preserve">________________, ____ de _____ de _______.</w:t>
+        </w:rPr>
+      </w:pPr>
+      <w:r>
+        <w:rPr>
+          <w:rtl w:val="0"/>
+        </w:rPr>
       </w:r>
     </w:p>
     <w:p>
@@ -1150,46 +1464,7 @@
         <w:shd w:fill="auto" w:val="clear"/>
         <w:spacing w:after="0" w:before="0" w:line="240" w:lineRule="auto"/>
         <w:ind w:left="0" w:right="0" w:firstLine="0"/>
-        <w:jc w:val="right"/>
-        <w:rPr>
-          <w:rFonts w:ascii="Arial" w:cs="Arial" w:eastAsia="Arial" w:hAnsi="Arial"/>
-          <w:b w:val="0"/>
-          <w:bCs w:val="0"/>
-          <w:i w:val="0"/>
-          <w:iCs w:val="0"/>
-          <w:smallCaps w:val="0"/>
-          <w:strike w:val="0"/>
-          <w:color w:val="000000"/>
-          <w:sz w:val="24"/>
-          <w:szCs w:val="24"/>
-          <w:u w:val="none"/>
-          <w:shd w:fill="auto" w:val="clear"/>
-          <w:vertAlign w:val="baseline"/>
-        </w:rPr>
-      </w:pPr>
-      <w:r>
-        <w:rPr>
-          <w:rtl w:val="0"/>
-        </w:rPr>
-      </w:r>
-    </w:p>
-    <w:p>
-      <w:pPr>
-        <w:keepNext w:val="0"/>
-        <w:keepLines w:val="0"/>
-        <w:pageBreakBefore w:val="0"/>
-        <w:widowControl w:val="0"/>
-        <w:pBdr>
-          <w:top w:space="0" w:sz="0" w:val="nil"/>
-          <w:left w:space="0" w:sz="0" w:val="nil"/>
-          <w:bottom w:space="0" w:sz="0" w:val="nil"/>
-          <w:right w:space="0" w:sz="0" w:val="nil"/>
-          <w:between w:space="0" w:sz="0" w:val="nil"/>
-        </w:pBdr>
-        <w:shd w:fill="auto" w:val="clear"/>
-        <w:spacing w:after="0" w:before="0" w:line="240" w:lineRule="auto"/>
-        <w:ind w:left="0" w:right="0" w:firstLine="0"/>
-        <w:jc w:val="right"/>
+        <w:jc w:val="center"/>
         <w:rPr>
           <w:rFonts w:ascii="Arial" w:cs="Arial" w:eastAsia="Arial" w:hAnsi="Arial"/>
           <w:b w:val="0"/>
@@ -1208,22 +1483,12 @@
       </w:pPr>
       <w:r>
         <w:rPr>
-          <w:rFonts w:ascii="Arial" w:cs="Arial" w:eastAsia="Arial" w:hAnsi="Arial"/>
-          <w:b w:val="0"/>
-          <w:bCs w:val="0"/>
-          <w:i w:val="0"/>
-          <w:iCs w:val="0"/>
-          <w:smallCaps w:val="0"/>
-          <w:strike w:val="0"/>
-          <w:color w:val="ff3333"/>
-          <w:sz w:val="24"/>
-          <w:szCs w:val="24"/>
-          <w:u w:val="none"/>
-          <w:shd w:fill="auto" w:val="clear"/>
-          <w:vertAlign w:val="baseline"/>
-          <w:rtl w:val="0"/>
-        </w:rPr>
-        <w:t xml:space="preserve">Assinatura da Direção do Campus</w:t>
+          <w:rFonts w:ascii="Arial" w:hAnsi="Arial"/>
+          <w:sz w:val="22"/>
+        </w:rPr>
+        <w:t>_____________________________________________________</w:t>
+        <w:br/>
+        <w:t>Assinatura da Direção do Campus Garopaba — IFSC</w:t>
       </w:r>
     </w:p>
     <w:sectPr>

</xml_diff>